<commit_message>
feat: work two done, Jesus thank you
</commit_message>
<xml_diff>
--- a/2026-05-18-help/2/KG_Kuzin_PR2.docx
+++ b/2026-05-18-help/2/KG_Kuzin_PR2.docx
@@ -188,7 +188,7 @@
           <w:iCs w:val="false"/>
           <w:lang w:val="uk-UA"/>
         </w:rPr>
-        <w:t>Далі було додано жовтий прямокутник інструментом «Прямокутник». Його ширину було встановлено у ширину робочої області, а висоту, що приблизно дорівнює висоті робочої області. Деталі на рисунку 1.2.</w:t>
+        <w:t>Далі було додано жовтий прямокутник. Його ширину було встановлено на всю ширину робочої області. Його висоту такою, що дорівнює половині висоти робочої області. Деталі на рисунку 1.2.</w:t>
       </w:r>
     </w:p>
     <w:p>
@@ -297,7 +297,7 @@
           <w:iCs w:val="false"/>
           <w:lang w:val="uk-UA"/>
         </w:rPr>
-        <w:t>Після цього було обрано створений прямокутник та здійснено команду Контур &gt; Ефекти контурів. У тому меню, що відкрилося, було обрано інструмент «Деформація за сіткою». Результат на рисунку 1.3.</w:t>
+        <w:t>Після цього було виділено створений прямокутник та виконано команду Контур &gt; Ефекти контурів. У меню, що відкрилося, було обрано інструмент «Деформація за сіткою». Деталі на рисунку 1.3.</w:t>
       </w:r>
     </w:p>
     <w:p>
@@ -646,19 +646,11 @@
     </w:p>
     <w:p>
       <w:pPr>
-        <w:pStyle w:val="p11"/>
-        <w:rPr>
-          <w:i w:val="false"/>
-          <w:iCs w:val="false"/>
-          <w:lang w:val="uk-UA"/>
-        </w:rPr>
-      </w:pPr>
-      <w:r>
-        <w:rPr>
-          <w:i w:val="false"/>
-          <w:iCs w:val="false"/>
-          <w:lang w:val="uk-UA"/>
-        </w:rPr>
+        <w:pStyle w:val="img1"/>
+        <w:rPr/>
+      </w:pPr>
+      <w:r>
+        <w:rPr/>
         <w:drawing>
           <wp:inline distT="0" distB="0" distL="0" distR="0">
             <wp:extent cx="5731510" cy="6268720"/>
@@ -701,37 +693,674 @@
     </w:p>
     <w:p>
       <w:pPr>
-        <w:pStyle w:val="p11"/>
-        <w:rPr>
-          <w:i w:val="false"/>
-          <w:iCs w:val="false"/>
-          <w:lang w:val="uk-UA"/>
-        </w:rPr>
-      </w:pPr>
-      <w:r>
-        <w:rPr>
-          <w:i w:val="false"/>
-          <w:iCs w:val="false"/>
-          <w:lang w:val="uk-UA"/>
-        </w:rPr>
-        <w:t>Рисунок 1.6 — Доданий логотип до візитівки</w:t>
-      </w:r>
-    </w:p>
-    <w:p>
-      <w:pPr>
-        <w:pStyle w:val="p11"/>
-        <w:rPr>
-          <w:i w:val="false"/>
-          <w:iCs w:val="false"/>
-          <w:lang w:val="uk-UA"/>
-        </w:rPr>
-      </w:pPr>
-      <w:r>
-        <w:rPr>
-          <w:i w:val="false"/>
-          <w:iCs w:val="false"/>
-          <w:lang w:val="uk-UA"/>
-        </w:rPr>
+        <w:pStyle w:val="img1"/>
+        <w:rPr/>
+      </w:pPr>
+      <w:r>
+        <w:rPr/>
+        <w:t>Рисунок 1.6 — Доданий логотип</w:t>
+      </w:r>
+    </w:p>
+    <w:p>
+      <w:pPr>
+        <w:pStyle w:val="p11"/>
+        <w:rPr>
+          <w:i w:val="false"/>
+          <w:iCs w:val="false"/>
+          <w:lang w:val="uk-UA"/>
+        </w:rPr>
+      </w:pPr>
+      <w:r>
+        <w:rPr>
+          <w:i w:val="false"/>
+          <w:iCs w:val="false"/>
+          <w:lang w:val="uk-UA"/>
+        </w:rPr>
+      </w:r>
+    </w:p>
+    <w:p>
+      <w:pPr>
+        <w:pStyle w:val="p11"/>
+        <w:rPr>
+          <w:i w:val="false"/>
+          <w:iCs w:val="false"/>
+          <w:lang w:val="uk-UA"/>
+        </w:rPr>
+      </w:pPr>
+      <w:r>
+        <w:rPr>
+          <w:i w:val="false"/>
+          <w:iCs w:val="false"/>
+          <w:lang w:val="uk-UA"/>
+        </w:rPr>
+        <w:t>Після цього до візитівки було додано текст: ім’я, прізвище, назва коледжу, група, контактні дані. Деталі на рисунку 1.7.</w:t>
+      </w:r>
+    </w:p>
+    <w:p>
+      <w:pPr>
+        <w:pStyle w:val="p11"/>
+        <w:rPr>
+          <w:i w:val="false"/>
+          <w:iCs w:val="false"/>
+          <w:lang w:val="uk-UA"/>
+        </w:rPr>
+      </w:pPr>
+      <w:r>
+        <w:rPr>
+          <w:i w:val="false"/>
+          <w:iCs w:val="false"/>
+          <w:lang w:val="uk-UA"/>
+        </w:rPr>
+      </w:r>
+    </w:p>
+    <w:p>
+      <w:pPr>
+        <w:pStyle w:val="img1"/>
+        <w:rPr/>
+      </w:pPr>
+      <w:r>
+        <w:rPr/>
+        <w:drawing>
+          <wp:inline distT="0" distB="0" distL="0" distR="0">
+            <wp:extent cx="5731510" cy="6268720"/>
+            <wp:effectExtent l="0" t="0" r="0" b="0"/>
+            <wp:docPr id="7" name="Зображення7"/>
+            <wp:cNvGraphicFramePr>
+              <a:graphicFrameLocks xmlns:a="http://schemas.openxmlformats.org/drawingml/2006/main" noChangeAspect="1"/>
+            </wp:cNvGraphicFramePr>
+            <a:graphic xmlns:a="http://schemas.openxmlformats.org/drawingml/2006/main">
+              <a:graphicData uri="http://schemas.openxmlformats.org/drawingml/2006/picture">
+                <pic:pic xmlns:pic="http://schemas.openxmlformats.org/drawingml/2006/picture">
+                  <pic:nvPicPr>
+                    <pic:cNvPr id="7" name="Зображення7"/>
+                    <pic:cNvPicPr>
+                      <a:picLocks noChangeAspect="1" noChangeArrowheads="1"/>
+                    </pic:cNvPicPr>
+                  </pic:nvPicPr>
+                  <pic:blipFill>
+                    <a:blip r:embed="rId8"/>
+                    <a:stretch>
+                      <a:fillRect/>
+                    </a:stretch>
+                  </pic:blipFill>
+                  <pic:spPr bwMode="auto">
+                    <a:xfrm>
+                      <a:off x="0" y="0"/>
+                      <a:ext cx="5731510" cy="6268720"/>
+                    </a:xfrm>
+                    <a:prstGeom prst="rect">
+                      <a:avLst/>
+                    </a:prstGeom>
+                    <a:noFill/>
+                  </pic:spPr>
+                </pic:pic>
+              </a:graphicData>
+            </a:graphic>
+          </wp:inline>
+        </w:drawing>
+      </w:r>
+    </w:p>
+    <w:p>
+      <w:pPr>
+        <w:pStyle w:val="img1"/>
+        <w:rPr/>
+      </w:pPr>
+      <w:r>
+        <w:rPr/>
+        <w:t>Рисунок 1.7 — Додані тексти</w:t>
+      </w:r>
+    </w:p>
+    <w:p>
+      <w:pPr>
+        <w:pStyle w:val="p11"/>
+        <w:rPr>
+          <w:i w:val="false"/>
+          <w:iCs w:val="false"/>
+          <w:lang w:val="uk-UA"/>
+        </w:rPr>
+      </w:pPr>
+      <w:r>
+        <w:rPr>
+          <w:i w:val="false"/>
+          <w:iCs w:val="false"/>
+          <w:lang w:val="uk-UA"/>
+        </w:rPr>
+      </w:r>
+    </w:p>
+    <w:p>
+      <w:pPr>
+        <w:pStyle w:val="p11"/>
+        <w:rPr>
+          <w:i w:val="false"/>
+          <w:iCs w:val="false"/>
+          <w:lang w:val="uk-UA"/>
+        </w:rPr>
+      </w:pPr>
+      <w:r>
+        <w:rPr>
+          <w:i w:val="false"/>
+          <w:iCs w:val="false"/>
+          <w:lang w:val="uk-UA"/>
+        </w:rPr>
+        <w:t>Після цього було створено два еліпси — один чорного кольору, другий червоного. До них було застосовано операцію Різниці. Деталі на рисунку 1.8.</w:t>
+      </w:r>
+    </w:p>
+    <w:p>
+      <w:pPr>
+        <w:pStyle w:val="p11"/>
+        <w:rPr>
+          <w:i w:val="false"/>
+          <w:iCs w:val="false"/>
+          <w:lang w:val="uk-UA"/>
+        </w:rPr>
+      </w:pPr>
+      <w:r>
+        <w:rPr>
+          <w:i w:val="false"/>
+          <w:iCs w:val="false"/>
+          <w:lang w:val="uk-UA"/>
+        </w:rPr>
+      </w:r>
+    </w:p>
+    <w:p>
+      <w:pPr>
+        <w:pStyle w:val="img1"/>
+        <w:rPr/>
+      </w:pPr>
+      <w:r>
+        <w:rPr/>
+        <w:drawing>
+          <wp:inline distT="0" distB="0" distL="0" distR="0">
+            <wp:extent cx="5731510" cy="6268720"/>
+            <wp:effectExtent l="0" t="0" r="0" b="0"/>
+            <wp:docPr id="8" name="Зображення8"/>
+            <wp:cNvGraphicFramePr>
+              <a:graphicFrameLocks xmlns:a="http://schemas.openxmlformats.org/drawingml/2006/main" noChangeAspect="1"/>
+            </wp:cNvGraphicFramePr>
+            <a:graphic xmlns:a="http://schemas.openxmlformats.org/drawingml/2006/main">
+              <a:graphicData uri="http://schemas.openxmlformats.org/drawingml/2006/picture">
+                <pic:pic xmlns:pic="http://schemas.openxmlformats.org/drawingml/2006/picture">
+                  <pic:nvPicPr>
+                    <pic:cNvPr id="8" name="Зображення8"/>
+                    <pic:cNvPicPr>
+                      <a:picLocks noChangeAspect="1" noChangeArrowheads="1"/>
+                    </pic:cNvPicPr>
+                  </pic:nvPicPr>
+                  <pic:blipFill>
+                    <a:blip r:embed="rId9"/>
+                    <a:stretch>
+                      <a:fillRect/>
+                    </a:stretch>
+                  </pic:blipFill>
+                  <pic:spPr bwMode="auto">
+                    <a:xfrm>
+                      <a:off x="0" y="0"/>
+                      <a:ext cx="5731510" cy="6268720"/>
+                    </a:xfrm>
+                    <a:prstGeom prst="rect">
+                      <a:avLst/>
+                    </a:prstGeom>
+                    <a:noFill/>
+                  </pic:spPr>
+                </pic:pic>
+              </a:graphicData>
+            </a:graphic>
+          </wp:inline>
+        </w:drawing>
+      </w:r>
+    </w:p>
+    <w:p>
+      <w:pPr>
+        <w:pStyle w:val="img1"/>
+        <w:rPr/>
+      </w:pPr>
+      <w:r>
+        <w:rPr/>
+        <w:t>Рисунок 1.8 — Створені два еліпси</w:t>
+      </w:r>
+    </w:p>
+    <w:p>
+      <w:pPr>
+        <w:pStyle w:val="p11"/>
+        <w:rPr>
+          <w:i w:val="false"/>
+          <w:iCs w:val="false"/>
+          <w:lang w:val="uk-UA"/>
+        </w:rPr>
+      </w:pPr>
+      <w:r>
+        <w:rPr>
+          <w:i w:val="false"/>
+          <w:iCs w:val="false"/>
+          <w:lang w:val="uk-UA"/>
+        </w:rPr>
+      </w:r>
+    </w:p>
+    <w:p>
+      <w:pPr>
+        <w:pStyle w:val="p11"/>
+        <w:rPr>
+          <w:i w:val="false"/>
+          <w:iCs w:val="false"/>
+          <w:lang w:val="uk-UA"/>
+        </w:rPr>
+      </w:pPr>
+      <w:r>
+        <w:rPr>
+          <w:i w:val="false"/>
+          <w:iCs w:val="false"/>
+          <w:lang w:val="uk-UA"/>
+        </w:rPr>
+        <w:t>Після застосування операції було отримано фігуру напівмісяця. До неї було додано два еліпси, щоб отримати значок телефонної слухавки. Деталі на рисунку 1.9.</w:t>
+      </w:r>
+    </w:p>
+    <w:p>
+      <w:pPr>
+        <w:pStyle w:val="p11"/>
+        <w:rPr>
+          <w:i w:val="false"/>
+          <w:iCs w:val="false"/>
+          <w:lang w:val="uk-UA"/>
+        </w:rPr>
+      </w:pPr>
+      <w:r>
+        <w:rPr>
+          <w:i w:val="false"/>
+          <w:iCs w:val="false"/>
+          <w:lang w:val="uk-UA"/>
+        </w:rPr>
+      </w:r>
+    </w:p>
+    <w:p>
+      <w:pPr>
+        <w:pStyle w:val="img1"/>
+        <w:rPr/>
+      </w:pPr>
+      <w:r>
+        <w:rPr/>
+        <w:drawing>
+          <wp:inline distT="0" distB="0" distL="0" distR="0">
+            <wp:extent cx="5731510" cy="6268720"/>
+            <wp:effectExtent l="0" t="0" r="0" b="0"/>
+            <wp:docPr id="9" name="Зображення9"/>
+            <wp:cNvGraphicFramePr>
+              <a:graphicFrameLocks xmlns:a="http://schemas.openxmlformats.org/drawingml/2006/main" noChangeAspect="1"/>
+            </wp:cNvGraphicFramePr>
+            <a:graphic xmlns:a="http://schemas.openxmlformats.org/drawingml/2006/main">
+              <a:graphicData uri="http://schemas.openxmlformats.org/drawingml/2006/picture">
+                <pic:pic xmlns:pic="http://schemas.openxmlformats.org/drawingml/2006/picture">
+                  <pic:nvPicPr>
+                    <pic:cNvPr id="9" name="Зображення9"/>
+                    <pic:cNvPicPr>
+                      <a:picLocks noChangeAspect="1" noChangeArrowheads="1"/>
+                    </pic:cNvPicPr>
+                  </pic:nvPicPr>
+                  <pic:blipFill>
+                    <a:blip r:embed="rId10"/>
+                    <a:stretch>
+                      <a:fillRect/>
+                    </a:stretch>
+                  </pic:blipFill>
+                  <pic:spPr bwMode="auto">
+                    <a:xfrm>
+                      <a:off x="0" y="0"/>
+                      <a:ext cx="5731510" cy="6268720"/>
+                    </a:xfrm>
+                    <a:prstGeom prst="rect">
+                      <a:avLst/>
+                    </a:prstGeom>
+                    <a:noFill/>
+                  </pic:spPr>
+                </pic:pic>
+              </a:graphicData>
+            </a:graphic>
+          </wp:inline>
+        </w:drawing>
+      </w:r>
+    </w:p>
+    <w:p>
+      <w:pPr>
+        <w:pStyle w:val="img1"/>
+        <w:rPr/>
+      </w:pPr>
+      <w:r>
+        <w:rPr/>
+        <w:t>Рисунок 1.9 — Отриман</w:t>
+      </w:r>
+      <w:r>
+        <w:rPr/>
+        <w:t>н</w:t>
+      </w:r>
+      <w:r>
+        <w:rPr/>
+        <w:t>а фігура слухавки</w:t>
+      </w:r>
+    </w:p>
+    <w:p>
+      <w:pPr>
+        <w:pStyle w:val="p11"/>
+        <w:rPr>
+          <w:i w:val="false"/>
+          <w:iCs w:val="false"/>
+          <w:lang w:val="uk-UA"/>
+        </w:rPr>
+      </w:pPr>
+      <w:r>
+        <w:rPr>
+          <w:i w:val="false"/>
+          <w:iCs w:val="false"/>
+          <w:lang w:val="uk-UA"/>
+        </w:rPr>
+      </w:r>
+    </w:p>
+    <w:p>
+      <w:pPr>
+        <w:pStyle w:val="p11"/>
+        <w:rPr>
+          <w:i w:val="false"/>
+          <w:iCs w:val="false"/>
+          <w:lang w:val="uk-UA"/>
+        </w:rPr>
+      </w:pPr>
+      <w:r>
+        <w:rPr>
+          <w:i w:val="false"/>
+          <w:iCs w:val="false"/>
+          <w:lang w:val="uk-UA"/>
+        </w:rPr>
+        <w:t>Всі три фігури було об’єднано в одну командою Контур &gt; Сума. Деталі на рисунку 1.10.</w:t>
+      </w:r>
+    </w:p>
+    <w:p>
+      <w:pPr>
+        <w:pStyle w:val="p11"/>
+        <w:rPr>
+          <w:i w:val="false"/>
+          <w:iCs w:val="false"/>
+          <w:lang w:val="uk-UA"/>
+        </w:rPr>
+      </w:pPr>
+      <w:r>
+        <w:rPr>
+          <w:i w:val="false"/>
+          <w:iCs w:val="false"/>
+          <w:lang w:val="uk-UA"/>
+        </w:rPr>
+      </w:r>
+    </w:p>
+    <w:p>
+      <w:pPr>
+        <w:pStyle w:val="img1"/>
+        <w:rPr/>
+      </w:pPr>
+      <w:r>
+        <w:rPr/>
+        <w:drawing>
+          <wp:inline distT="0" distB="0" distL="0" distR="0">
+            <wp:extent cx="5731510" cy="6268720"/>
+            <wp:effectExtent l="0" t="0" r="0" b="0"/>
+            <wp:docPr id="10" name="Зображення10"/>
+            <wp:cNvGraphicFramePr>
+              <a:graphicFrameLocks xmlns:a="http://schemas.openxmlformats.org/drawingml/2006/main" noChangeAspect="1"/>
+            </wp:cNvGraphicFramePr>
+            <a:graphic xmlns:a="http://schemas.openxmlformats.org/drawingml/2006/main">
+              <a:graphicData uri="http://schemas.openxmlformats.org/drawingml/2006/picture">
+                <pic:pic xmlns:pic="http://schemas.openxmlformats.org/drawingml/2006/picture">
+                  <pic:nvPicPr>
+                    <pic:cNvPr id="10" name="Зображення10"/>
+                    <pic:cNvPicPr>
+                      <a:picLocks noChangeAspect="1" noChangeArrowheads="1"/>
+                    </pic:cNvPicPr>
+                  </pic:nvPicPr>
+                  <pic:blipFill>
+                    <a:blip r:embed="rId11"/>
+                    <a:stretch>
+                      <a:fillRect/>
+                    </a:stretch>
+                  </pic:blipFill>
+                  <pic:spPr bwMode="auto">
+                    <a:xfrm>
+                      <a:off x="0" y="0"/>
+                      <a:ext cx="5731510" cy="6268720"/>
+                    </a:xfrm>
+                    <a:prstGeom prst="rect">
+                      <a:avLst/>
+                    </a:prstGeom>
+                    <a:noFill/>
+                  </pic:spPr>
+                </pic:pic>
+              </a:graphicData>
+            </a:graphic>
+          </wp:inline>
+        </w:drawing>
+      </w:r>
+    </w:p>
+    <w:p>
+      <w:pPr>
+        <w:pStyle w:val="img1"/>
+        <w:rPr/>
+      </w:pPr>
+      <w:r>
+        <w:rPr/>
+        <w:t>Рисунок 1.10 — Об’єднана фігура слухавки</w:t>
+      </w:r>
+    </w:p>
+    <w:p>
+      <w:pPr>
+        <w:pStyle w:val="p11"/>
+        <w:rPr>
+          <w:i w:val="false"/>
+          <w:iCs w:val="false"/>
+          <w:lang w:val="uk-UA"/>
+        </w:rPr>
+      </w:pPr>
+      <w:r>
+        <w:rPr>
+          <w:i w:val="false"/>
+          <w:iCs w:val="false"/>
+          <w:lang w:val="uk-UA"/>
+        </w:rPr>
+      </w:r>
+    </w:p>
+    <w:p>
+      <w:pPr>
+        <w:pStyle w:val="p11"/>
+        <w:rPr>
+          <w:i w:val="false"/>
+          <w:iCs w:val="false"/>
+          <w:lang w:val="uk-UA"/>
+        </w:rPr>
+      </w:pPr>
+      <w:r>
+        <w:rPr>
+          <w:i w:val="false"/>
+          <w:iCs w:val="false"/>
+          <w:lang w:val="uk-UA"/>
+        </w:rPr>
+        <w:t>Далі було створено іконку електронної пошти. Було намальовано чорний прямокутник і на ньому пером намальовано лінії. Деталі на рисунку 1.11.</w:t>
+      </w:r>
+    </w:p>
+    <w:p>
+      <w:pPr>
+        <w:pStyle w:val="p11"/>
+        <w:rPr>
+          <w:i w:val="false"/>
+          <w:iCs w:val="false"/>
+          <w:lang w:val="uk-UA"/>
+        </w:rPr>
+      </w:pPr>
+      <w:r>
+        <w:rPr>
+          <w:i w:val="false"/>
+          <w:iCs w:val="false"/>
+          <w:lang w:val="uk-UA"/>
+        </w:rPr>
+      </w:r>
+    </w:p>
+    <w:p>
+      <w:pPr>
+        <w:pStyle w:val="img1"/>
+        <w:rPr/>
+      </w:pPr>
+      <w:r>
+        <w:rPr/>
+        <w:drawing>
+          <wp:inline distT="0" distB="0" distL="0" distR="0">
+            <wp:extent cx="5731510" cy="6268720"/>
+            <wp:effectExtent l="0" t="0" r="0" b="0"/>
+            <wp:docPr id="11" name="Зображення11"/>
+            <wp:cNvGraphicFramePr>
+              <a:graphicFrameLocks xmlns:a="http://schemas.openxmlformats.org/drawingml/2006/main" noChangeAspect="1"/>
+            </wp:cNvGraphicFramePr>
+            <a:graphic xmlns:a="http://schemas.openxmlformats.org/drawingml/2006/main">
+              <a:graphicData uri="http://schemas.openxmlformats.org/drawingml/2006/picture">
+                <pic:pic xmlns:pic="http://schemas.openxmlformats.org/drawingml/2006/picture">
+                  <pic:nvPicPr>
+                    <pic:cNvPr id="11" name="Зображення11"/>
+                    <pic:cNvPicPr>
+                      <a:picLocks noChangeAspect="1" noChangeArrowheads="1"/>
+                    </pic:cNvPicPr>
+                  </pic:nvPicPr>
+                  <pic:blipFill>
+                    <a:blip r:embed="rId12"/>
+                    <a:stretch>
+                      <a:fillRect/>
+                    </a:stretch>
+                  </pic:blipFill>
+                  <pic:spPr bwMode="auto">
+                    <a:xfrm>
+                      <a:off x="0" y="0"/>
+                      <a:ext cx="5731510" cy="6268720"/>
+                    </a:xfrm>
+                    <a:prstGeom prst="rect">
+                      <a:avLst/>
+                    </a:prstGeom>
+                    <a:noFill/>
+                  </pic:spPr>
+                </pic:pic>
+              </a:graphicData>
+            </a:graphic>
+          </wp:inline>
+        </w:drawing>
+      </w:r>
+    </w:p>
+    <w:p>
+      <w:pPr>
+        <w:pStyle w:val="img1"/>
+        <w:rPr/>
+      </w:pPr>
+      <w:r>
+        <w:rPr/>
+        <w:t>Рисунок 1.11 — Створена іконка електронної пошти</w:t>
+      </w:r>
+    </w:p>
+    <w:p>
+      <w:pPr>
+        <w:pStyle w:val="p11"/>
+        <w:rPr>
+          <w:i w:val="false"/>
+          <w:iCs w:val="false"/>
+          <w:lang w:val="uk-UA"/>
+        </w:rPr>
+      </w:pPr>
+      <w:r>
+        <w:rPr>
+          <w:i w:val="false"/>
+          <w:iCs w:val="false"/>
+          <w:lang w:val="uk-UA"/>
+        </w:rPr>
+      </w:r>
+    </w:p>
+    <w:p>
+      <w:pPr>
+        <w:pStyle w:val="p11"/>
+        <w:rPr>
+          <w:i w:val="false"/>
+          <w:iCs w:val="false"/>
+          <w:lang w:val="uk-UA"/>
+        </w:rPr>
+      </w:pPr>
+      <w:r>
+        <w:rPr>
+          <w:i w:val="false"/>
+          <w:iCs w:val="false"/>
+          <w:lang w:val="uk-UA"/>
+        </w:rPr>
+        <w:t>Після цього створені дві іконки було нахилено та перенесено до своїх місць біля контактних даних. Деталі на рисунку 1.12.</w:t>
+      </w:r>
+    </w:p>
+    <w:p>
+      <w:pPr>
+        <w:pStyle w:val="p11"/>
+        <w:rPr>
+          <w:i w:val="false"/>
+          <w:iCs w:val="false"/>
+          <w:lang w:val="uk-UA"/>
+        </w:rPr>
+      </w:pPr>
+      <w:r>
+        <w:rPr>
+          <w:i w:val="false"/>
+          <w:iCs w:val="false"/>
+          <w:lang w:val="uk-UA"/>
+        </w:rPr>
+      </w:r>
+    </w:p>
+    <w:p>
+      <w:pPr>
+        <w:pStyle w:val="img1"/>
+        <w:rPr/>
+      </w:pPr>
+      <w:r>
+        <w:rPr/>
+        <w:drawing>
+          <wp:inline distT="0" distB="0" distL="0" distR="0">
+            <wp:extent cx="5731510" cy="6268720"/>
+            <wp:effectExtent l="0" t="0" r="0" b="0"/>
+            <wp:docPr id="12" name="Зображення13"/>
+            <wp:cNvGraphicFramePr>
+              <a:graphicFrameLocks xmlns:a="http://schemas.openxmlformats.org/drawingml/2006/main" noChangeAspect="1"/>
+            </wp:cNvGraphicFramePr>
+            <a:graphic xmlns:a="http://schemas.openxmlformats.org/drawingml/2006/main">
+              <a:graphicData uri="http://schemas.openxmlformats.org/drawingml/2006/picture">
+                <pic:pic xmlns:pic="http://schemas.openxmlformats.org/drawingml/2006/picture">
+                  <pic:nvPicPr>
+                    <pic:cNvPr id="12" name="Зображення13"/>
+                    <pic:cNvPicPr>
+                      <a:picLocks noChangeAspect="1" noChangeArrowheads="1"/>
+                    </pic:cNvPicPr>
+                  </pic:nvPicPr>
+                  <pic:blipFill>
+                    <a:blip r:embed="rId13"/>
+                    <a:stretch>
+                      <a:fillRect/>
+                    </a:stretch>
+                  </pic:blipFill>
+                  <pic:spPr bwMode="auto">
+                    <a:xfrm>
+                      <a:off x="0" y="0"/>
+                      <a:ext cx="5731510" cy="6268720"/>
+                    </a:xfrm>
+                    <a:prstGeom prst="rect">
+                      <a:avLst/>
+                    </a:prstGeom>
+                    <a:noFill/>
+                  </pic:spPr>
+                </pic:pic>
+              </a:graphicData>
+            </a:graphic>
+          </wp:inline>
+        </w:drawing>
+      </w:r>
+    </w:p>
+    <w:p>
+      <w:pPr>
+        <w:pStyle w:val="img1"/>
+        <w:rPr/>
+      </w:pPr>
+      <w:r>
+        <w:rPr/>
+        <w:t>Рисунок 1.12 — Перенесені іконки</w:t>
       </w:r>
     </w:p>
     <w:p>
@@ -814,6 +1443,50 @@
       </w:pPr>
       <w:r>
         <w:rPr/>
+        <w:drawing>
+          <wp:inline distT="0" distB="0" distL="0" distR="0">
+            <wp:extent cx="5804535" cy="3324225"/>
+            <wp:effectExtent l="0" t="0" r="0" b="0"/>
+            <wp:docPr id="13" name="Зображення12"/>
+            <wp:cNvGraphicFramePr>
+              <a:graphicFrameLocks xmlns:a="http://schemas.openxmlformats.org/drawingml/2006/main" noChangeAspect="1"/>
+            </wp:cNvGraphicFramePr>
+            <a:graphic xmlns:a="http://schemas.openxmlformats.org/drawingml/2006/main">
+              <a:graphicData uri="http://schemas.openxmlformats.org/drawingml/2006/picture">
+                <pic:pic xmlns:pic="http://schemas.openxmlformats.org/drawingml/2006/picture">
+                  <pic:nvPicPr>
+                    <pic:cNvPr id="13" name="Зображення12"/>
+                    <pic:cNvPicPr>
+                      <a:picLocks noChangeAspect="1" noChangeArrowheads="1"/>
+                    </pic:cNvPicPr>
+                  </pic:nvPicPr>
+                  <pic:blipFill>
+                    <a:blip r:embed="rId14">
+                      <a:extLst>
+                        <a:ext uri="{96DAC541-7B7A-43D3-8B79-37D633B846F1}">
+                          <asvg:svgBlip xmlns:asvg="http://schemas.microsoft.com/office/drawing/2016/SVG/main" r:embed="rId15"/>
+                        </a:ext>
+                      </a:extLst>
+                    </a:blip>
+                    <a:stretch>
+                      <a:fillRect/>
+                    </a:stretch>
+                  </pic:blipFill>
+                  <pic:spPr bwMode="auto">
+                    <a:xfrm>
+                      <a:off x="0" y="0"/>
+                      <a:ext cx="5804535" cy="3324225"/>
+                    </a:xfrm>
+                    <a:prstGeom prst="rect">
+                      <a:avLst/>
+                    </a:prstGeom>
+                    <a:noFill/>
+                  </pic:spPr>
+                </pic:pic>
+              </a:graphicData>
+            </a:graphic>
+          </wp:inline>
+        </w:drawing>
       </w:r>
     </w:p>
     <w:p>

</xml_diff>